<commit_message>
Correct best model to Random Forest in documentation and reports
</commit_message>
<xml_diff>
--- a/report/Customer_Churn_Report.docx
+++ b/report/Customer_Churn_Report.docx
@@ -564,7 +564,7 @@
         <w:pStyle w:val="ListBullet"/>
       </w:pPr>
       <w:r>
-        <w:t>The XGBoost model achieved the best overall performance, particularly in terms of ROC-AUC and balancing Precision with Recall.</w:t>
+        <w:t>The Random Forest model achieved the best overall performance, particularly in terms of ROC-AUC and balancing Precision with Recall.</w:t>
       </w:r>
     </w:p>
     <w:p>
@@ -601,7 +601,7 @@
     </w:p>
     <w:p>
       <w:r>
-        <w:t>By utilizing the XGBoost model, the bank can reliably identify a large portion of customers who are about to churn. The business should proactively target high-balance customers and older demographics in Germany with tailored retention campaigns. Specifically, offering premium services or better interest rates to high-balance clients, and encouraging single-product users to adopt a second product, could significantly reduce the overall churn rate and preserve valuable revenue.</w:t>
+        <w:t>By utilizing the Random Forest model, the bank can reliably identify a large portion of customers who are about to churn. The business should proactively target high-balance customers and older demographics in Germany with tailored retention campaigns. Specifically, offering premium services or better interest rates to high-balance clients, and encouraging single-product users to adopt a second product, could significantly reduce the overall churn rate and preserve valuable revenue.</w:t>
       </w:r>
     </w:p>
     <w:p>

</xml_diff>

<commit_message>
Update Author name and contributor in DOCX report
</commit_message>
<xml_diff>
--- a/report/Customer_Churn_Report.docx
+++ b/report/Customer_Churn_Report.docx
@@ -18,15 +18,7 @@
         <w:jc w:val="center"/>
       </w:pPr>
       <w:r>
-        <w:t>Author: J P Pankaj</w:t>
-      </w:r>
-    </w:p>
-    <w:p>
-      <w:pPr>
-        <w:jc w:val="center"/>
-      </w:pPr>
-      <w:r>
-        <w:t>Date: August 02, 2026</w:t>
+        <w:t>Author: J P Pankaj Singh</w:t>
       </w:r>
     </w:p>
     <w:p>
@@ -636,6 +628,17 @@
         <w:t>There is no information regarding the reason for churn, making it difficult to distinguish between unavoidable churn (e.g., death, relocation) and preventable churn (e.g., competitor offers).</w:t>
       </w:r>
     </w:p>
+    <w:p>
+      <w:pPr>
+        <w:jc w:val="center"/>
+      </w:pPr>
+      <w:r>
+        <w:rPr>
+          <w:i/>
+        </w:rPr>
+        <w:t>Contributor: ps-creater's team</w:t>
+      </w:r>
+    </w:p>
     <w:sectPr>
       <w:pgSz w:w="12240" w:h="15840"/>
       <w:pgMar w:top="1440" w:right="1800" w:bottom="1440" w:left="1800" w:header="720" w:footer="720" w:gutter="0"/>

</xml_diff>